<commit_message>
Ajuste no dahsboard e reporting, filtro por ano e novos campos para ajuste do VAB.
</commit_message>
<xml_diff>
--- a/docs/MANUAL_USO_WHYMOB.docx
+++ b/docs/MANUAL_USO_WHYMOB.docx
@@ -2607,6 +2607,88 @@
       </w:pPr>
       <w:r>
         <w:t>acompanhar resultados em dashboard e reporting</w:t>
+      </w:r>
+    </w:p>
+    <w:p>
+      <w:r>
+        <w:rPr>
+          <w:b/>
+          <w:color w:val="002FA7"/>
+          <w:sz w:val="30"/>
+        </w:rPr>
+        <w:t>14. Regras de reporting e exportacao</w:t>
+      </w:r>
+    </w:p>
+    <w:p>
+      <w:pPr>
+        <w:spacing w:after="100"/>
+      </w:pPr>
+      <w:r>
+        <w:t>O seletor de ano do Dashboard e do Reporting e aplicado aos indicadores e aos graficos.</w:t>
+      </w:r>
+    </w:p>
+    <w:p>
+      <w:pPr>
+        <w:pStyle w:val="ListBullet"/>
+      </w:pPr>
+      <w:r>
+        <w:t>`Faturado no ano`: soma faturas ativas pela data real de emissao (`invoices.issued_at`), sem IVA.</w:t>
+      </w:r>
+    </w:p>
+    <w:p>
+      <w:pPr>
+        <w:pStyle w:val="ListBullet"/>
+      </w:pPr>
+      <w:r>
+        <w:t>`VAB faturado no ano`: calcula o VAB proporcional ao valor sem IVA efetivamente faturado no ano.</w:t>
+      </w:r>
+    </w:p>
+    <w:p>
+      <w:pPr>
+        <w:pStyle w:val="ListBullet"/>
+      </w:pPr>
+      <w:r>
+        <w:t>Faturas anuladas e encomendas canceladas/anuladas nao entram nos indicadores.</w:t>
+      </w:r>
+    </w:p>
+    <w:p>
+      <w:pPr>
+        <w:pStyle w:val="ListBullet"/>
+      </w:pPr>
+      <w:r>
+        <w:t>O grafico mensal usa a data real de emissao da fatura.</w:t>
+      </w:r>
+    </w:p>
+    <w:p>
+      <w:pPr>
+        <w:pStyle w:val="ListBullet"/>
+      </w:pPr>
+      <w:r>
+        <w:t>O PDF anual usa a data de emissao para os totais faturados. A data prevista do plano fica no detalhe e nao exclui uma fatura emitida no ano.</w:t>
+      </w:r>
+    </w:p>
+    <w:p>
+      <w:pPr>
+        <w:pStyle w:val="ListBullet"/>
+      </w:pPr>
+      <w:r>
+        <w:t>Planeado e por faturar continuam agrupados pela data prevista (`plan_lines.expected_date`).</w:t>
+      </w:r>
+    </w:p>
+    <w:p>
+      <w:pPr>
+        <w:spacing w:after="100"/>
+      </w:pPr>
+      <w:r>
+        <w:t>Os botoes `Faturacao anual PDF` e `Faturacao anual Excel/CSV` permitem exportar o ano completo ou um periodo de meses dentro do ano selecionado. O PDF e agrupado por mes e mostra planeado, faturado, VAB faturado, por faturar e VAB por faturar, incluindo o total mensal, sem a coluna de item/fatura. O CSV abre diretamente no Excel e contem uma linha por item/fatura, com valores em EUR, separador decimal por virgula e meses em formato portugues.</w:t>
+      </w:r>
+    </w:p>
+    <w:p>
+      <w:pPr>
+        <w:spacing w:after="100"/>
+      </w:pPr>
+      <w:r>
+        <w:t>Exportacoes principais: Dashboard PDF por ano; ordem de faturacao por mes; faturas CSV; reporting comercial CSV; encomendas com propostas; propostas CSV; e faturacao anual PDF/CSV.</w:t>
       </w:r>
     </w:p>
     <w:p>

</xml_diff>